<commit_message>
docs: added Education, style: adjusted for different screen sizes
</commit_message>
<xml_diff>
--- a/CV_Virginia Celine Oei.docx
+++ b/CV_Virginia Celine Oei.docx
@@ -731,8 +731,42 @@
           <w:sz w:val="18"/>
           <w:szCs w:val="20"/>
         </w:rPr>
-        <w:t>July, 2025 – Jan, 2026</w:t>
-      </w:r>
+        <w:t>July</w:t>
+      </w:r>
+      <w:r>
+        <w:rPr>
+          <w:b/>
+          <w:sz w:val="18"/>
+          <w:szCs w:val="20"/>
+        </w:rPr>
+        <w:t xml:space="preserve">, </w:t>
+      </w:r>
+      <w:r>
+        <w:rPr>
+          <w:b/>
+          <w:sz w:val="18"/>
+          <w:szCs w:val="20"/>
+        </w:rPr>
+        <w:t>2018</w:t>
+      </w:r>
+      <w:r>
+        <w:rPr>
+          <w:b/>
+          <w:sz w:val="18"/>
+          <w:szCs w:val="20"/>
+        </w:rPr>
+        <w:t xml:space="preserve"> – </w:t>
+      </w:r>
+      <w:r>
+        <w:rPr>
+          <w:b/>
+          <w:sz w:val="18"/>
+          <w:szCs w:val="20"/>
+        </w:rPr>
+        <w:t>Aug, 2024</w:t>
+      </w:r>
+      <w:bookmarkStart w:id="0" w:name="_GoBack"/>
+      <w:bookmarkEnd w:id="0"/>
       <w:r>
         <w:rPr>
           <w:b/>
@@ -801,8 +835,8 @@
           <w:szCs w:val="20"/>
         </w:rPr>
       </w:pPr>
-      <w:bookmarkStart w:id="0" w:name="_gjdgxs" w:colFirst="0" w:colLast="0"/>
-      <w:bookmarkEnd w:id="0"/>
+      <w:bookmarkStart w:id="1" w:name="_gjdgxs" w:colFirst="0" w:colLast="0"/>
+      <w:bookmarkEnd w:id="1"/>
     </w:p>
     <w:p>
       <w:pPr>
@@ -1231,25 +1265,7 @@
           <w:sz w:val="18"/>
           <w:szCs w:val="20"/>
         </w:rPr>
-        <w:t>Oct</w:t>
-      </w:r>
-      <w:r>
-        <w:rPr>
-          <w:b/>
-          <w:bCs/>
-          <w:sz w:val="18"/>
-          <w:szCs w:val="20"/>
-        </w:rPr>
-        <w:t>,</w:t>
-      </w:r>
-      <w:r>
-        <w:rPr>
-          <w:b/>
-          <w:bCs/>
-          <w:sz w:val="18"/>
-          <w:szCs w:val="20"/>
-        </w:rPr>
-        <w:t xml:space="preserve"> 2025</w:t>
+        <w:t>Oct, 2025</w:t>
       </w:r>
     </w:p>
     <w:p>
@@ -1457,16 +1473,7 @@
           <w:szCs w:val="20"/>
         </w:rPr>
         <w:tab/>
-        <w:t>Sep</w:t>
-      </w:r>
-      <w:r>
-        <w:rPr>
-          <w:b/>
-          <w:bCs/>
-          <w:sz w:val="18"/>
-          <w:szCs w:val="20"/>
-        </w:rPr>
-        <w:t>, 2025</w:t>
+        <w:t>Sep, 2025</w:t>
       </w:r>
     </w:p>
     <w:p>
@@ -2036,8 +2043,6 @@
           <w:sz w:val="21"/>
         </w:rPr>
       </w:pPr>
-      <w:bookmarkStart w:id="1" w:name="_GoBack"/>
-      <w:bookmarkEnd w:id="1"/>
     </w:p>
     <w:sectPr>
       <w:pgSz w:w="12240" w:h="15840"/>

</xml_diff>